<commit_message>
learn(CdC) : relire et signer le CdC
[5][Done]
</commit_message>
<xml_diff>
--- a/doc/P_App_Webstore.docx
+++ b/doc/P_App_Webstore.docx
@@ -1,6 +1,6 @@
 
 <file path=word/document.xml><?xml version="1.0" encoding="utf-8"?>
-<w:document xmlns:wpc="http://schemas.microsoft.com/office/word/2010/wordprocessingCanvas" xmlns:cx="http://schemas.microsoft.com/office/drawing/2014/chartex" xmlns:cx1="http://schemas.microsoft.com/office/drawing/2015/9/8/chartex" xmlns:cx2="http://schemas.microsoft.com/office/drawing/2015/10/21/chartex" xmlns:cx3="http://schemas.microsoft.com/office/drawing/2016/5/9/chartex" xmlns:cx4="http://schemas.microsoft.com/office/drawing/2016/5/10/chartex" xmlns:cx5="http://schemas.microsoft.com/office/drawing/2016/5/11/chartex" xmlns:cx6="http://schemas.microsoft.com/office/drawing/2016/5/12/chartex" xmlns:cx7="http://schemas.microsoft.com/office/drawing/2016/5/13/chartex" xmlns:cx8="http://schemas.microsoft.com/office/drawing/2016/5/14/chartex" xmlns:mc="http://schemas.openxmlformats.org/markup-compatibility/2006" xmlns:aink="http://schemas.microsoft.com/office/drawing/2016/ink" xmlns:am3d="http://schemas.microsoft.com/office/drawing/2017/model3d" xmlns:o="urn:schemas-microsoft-com:office:office" xmlns:oel="http://schemas.microsoft.com/office/2019/extlst" xmlns:r="http://schemas.openxmlformats.org/officeDocument/2006/relationships" xmlns:m="http://schemas.openxmlformats.org/officeDocument/2006/math" xmlns:v="urn:schemas-microsoft-com:vml" xmlns:wp14="http://schemas.microsoft.com/office/word/2010/wordprocessingDrawing" xmlns:wp="http://schemas.openxmlformats.org/drawingml/2006/wordprocessingDrawing" xmlns:w10="urn:schemas-microsoft-com:office:word" xmlns:w="http://schemas.openxmlformats.org/wordprocessingml/2006/main" xmlns:w14="http://schemas.microsoft.com/office/word/2010/wordml" xmlns:w15="http://schemas.microsoft.com/office/word/2012/wordml" xmlns:w16cex="http://schemas.microsoft.com/office/word/2018/wordml/cex" xmlns:w16cid="http://schemas.microsoft.com/office/word/2016/wordml/cid" xmlns:w16="http://schemas.microsoft.com/office/word/2018/wordml" xmlns:w16du="http://schemas.microsoft.com/office/word/2023/wordml/word16du" xmlns:w16sdtdh="http://schemas.microsoft.com/office/word/2020/wordml/sdtdatahash" xmlns:w16sdtfl="http://schemas.microsoft.com/office/word/2024/wordml/sdtformatlock" xmlns:w16se="http://schemas.microsoft.com/office/word/2015/wordml/symex" xmlns:wpg="http://schemas.microsoft.com/office/word/2010/wordprocessingGroup" xmlns:wpi="http://schemas.microsoft.com/office/word/2010/wordprocessingInk" xmlns:wne="http://schemas.microsoft.com/office/word/2006/wordml" xmlns:wps="http://schemas.microsoft.com/office/word/2010/wordprocessingShape" mc:Ignorable="w14 w15 w16se w16cid w16 w16cex w16sdtdh w16sdtfl w16du wp14">
+<w:document xmlns:wpc="http://schemas.microsoft.com/office/word/2010/wordprocessingCanvas" xmlns:cx="http://schemas.microsoft.com/office/drawing/2014/chartex" xmlns:cx1="http://schemas.microsoft.com/office/drawing/2015/9/8/chartex" xmlns:cx2="http://schemas.microsoft.com/office/drawing/2015/10/21/chartex" xmlns:cx3="http://schemas.microsoft.com/office/drawing/2016/5/9/chartex" xmlns:cx4="http://schemas.microsoft.com/office/drawing/2016/5/10/chartex" xmlns:cx5="http://schemas.microsoft.com/office/drawing/2016/5/11/chartex" xmlns:cx6="http://schemas.microsoft.com/office/drawing/2016/5/12/chartex" xmlns:cx7="http://schemas.microsoft.com/office/drawing/2016/5/13/chartex" xmlns:cx8="http://schemas.microsoft.com/office/drawing/2016/5/14/chartex" xmlns:mc="http://schemas.openxmlformats.org/markup-compatibility/2006" xmlns:aink="http://schemas.microsoft.com/office/drawing/2016/ink" xmlns:am3d="http://schemas.microsoft.com/office/drawing/2017/model3d" xmlns:o="urn:schemas-microsoft-com:office:office" xmlns:oel="http://schemas.microsoft.com/office/2019/extlst" xmlns:r="http://schemas.openxmlformats.org/officeDocument/2006/relationships" xmlns:m="http://schemas.openxmlformats.org/officeDocument/2006/math" xmlns:v="urn:schemas-microsoft-com:vml" xmlns:wp14="http://schemas.microsoft.com/office/word/2010/wordprocessingDrawing" xmlns:wp="http://schemas.openxmlformats.org/drawingml/2006/wordprocessingDrawing" xmlns:w10="urn:schemas-microsoft-com:office:word" xmlns:w="http://schemas.openxmlformats.org/wordprocessingml/2006/main" xmlns:w14="http://schemas.microsoft.com/office/word/2010/wordml" xmlns:w15="http://schemas.microsoft.com/office/word/2012/wordml" xmlns:w16cex="http://schemas.microsoft.com/office/word/2018/wordml/cex" xmlns:w16cid="http://schemas.microsoft.com/office/word/2016/wordml/cid" xmlns:w16="http://schemas.microsoft.com/office/word/2018/wordml" xmlns:w16sdtdh="http://schemas.microsoft.com/office/word/2020/wordml/sdtdatahash" xmlns:w16se="http://schemas.microsoft.com/office/word/2015/wordml/symex" xmlns:wpg="http://schemas.microsoft.com/office/word/2010/wordprocessingGroup" xmlns:wpi="http://schemas.microsoft.com/office/word/2010/wordprocessingInk" xmlns:wne="http://schemas.microsoft.com/office/word/2006/wordml" xmlns:wps="http://schemas.microsoft.com/office/word/2010/wordprocessingShape" mc:Ignorable="w14 w15 w16se w16cid w16 w16cex w16sdtdh wp14">
   <w:body>
     <w:p>
       <w:pPr>
@@ -49,13 +49,7 @@
           </w:tcPr>
           <w:p>
             <w:r>
-              <w:t>Candidat</w:t>
-            </w:r>
-            <w:r>
-              <w:t>(s)</w:t>
-            </w:r>
-            <w:r>
-              <w:t xml:space="preserve"> :</w:t>
+              <w:t>Candidat :</w:t>
             </w:r>
           </w:p>
         </w:tc>
@@ -70,6 +64,9 @@
             </w:r>
             <w:r>
               <w:t xml:space="preserve"> </w:t>
+            </w:r>
+            <w:r>
+              <w:t>Junod</w:t>
             </w:r>
           </w:p>
         </w:tc>
@@ -87,6 +84,9 @@
             </w:r>
             <w:r>
               <w:t xml:space="preserve"> </w:t>
+            </w:r>
+            <w:r>
+              <w:t>Jonathan</w:t>
             </w:r>
           </w:p>
         </w:tc>
@@ -184,6 +184,11 @@
             <w:r>
               <w:t xml:space="preserve">Nom : </w:t>
             </w:r>
+            <w:proofErr w:type="spellStart"/>
+            <w:r>
+              <w:t>Sonney</w:t>
+            </w:r>
+            <w:proofErr w:type="spellEnd"/>
           </w:p>
         </w:tc>
         <w:tc>
@@ -194,6 +199,9 @@
           <w:p>
             <w:r>
               <w:t xml:space="preserve">Prénom : </w:t>
+            </w:r>
+            <w:r>
+              <w:t>Gaël</w:t>
             </w:r>
           </w:p>
         </w:tc>
@@ -718,7 +726,15 @@
         </w:numPr>
       </w:pPr>
       <w:r>
-        <w:t>Implémenter l’utilisation d’un token JWT</w:t>
+        <w:t xml:space="preserve">Implémenter l’utilisation d’un </w:t>
+      </w:r>
+      <w:proofErr w:type="spellStart"/>
+      <w:r>
+        <w:t>token</w:t>
+      </w:r>
+      <w:proofErr w:type="spellEnd"/>
+      <w:r>
+        <w:t xml:space="preserve"> JWT</w:t>
       </w:r>
     </w:p>
     <w:p>
@@ -796,7 +812,15 @@
         </w:numPr>
       </w:pPr>
       <w:r>
-        <w:t xml:space="preserve">Limiter la durée du token JWT </w:t>
+        <w:t xml:space="preserve">Limiter la durée du </w:t>
+      </w:r>
+      <w:proofErr w:type="spellStart"/>
+      <w:r>
+        <w:t>token</w:t>
+      </w:r>
+      <w:proofErr w:type="spellEnd"/>
+      <w:r>
+        <w:t xml:space="preserve"> JWT </w:t>
       </w:r>
       <w:r>
         <w:t>actuel et i</w:t>
@@ -804,9 +828,19 @@
       <w:r>
         <w:t xml:space="preserve">mplémenter un </w:t>
       </w:r>
-      <w:r>
-        <w:t>refresh token</w:t>
-      </w:r>
+      <w:proofErr w:type="spellStart"/>
+      <w:r>
+        <w:t>refresh</w:t>
+      </w:r>
+      <w:proofErr w:type="spellEnd"/>
+      <w:r>
+        <w:t xml:space="preserve"> </w:t>
+      </w:r>
+      <w:proofErr w:type="spellStart"/>
+      <w:r>
+        <w:t>token</w:t>
+      </w:r>
+      <w:proofErr w:type="spellEnd"/>
       <w:r>
         <w:t xml:space="preserve"> pour rester connect</w:t>
       </w:r>
@@ -841,7 +875,15 @@
         <w:t>Vérifier la résistance de vo</w:t>
       </w:r>
       <w:r>
-        <w:t>s hash avec l’outil John The Ripper et aux rainbow tables, via un export de la BDD</w:t>
+        <w:t xml:space="preserve">s hash avec l’outil John The Ripper et aux </w:t>
+      </w:r>
+      <w:proofErr w:type="spellStart"/>
+      <w:r>
+        <w:t>rainbow</w:t>
+      </w:r>
+      <w:proofErr w:type="spellEnd"/>
+      <w:r>
+        <w:t xml:space="preserve"> tables, via un export de la BDD</w:t>
       </w:r>
     </w:p>
     <w:p>
@@ -918,10 +960,7 @@
         <w:t>c</w:t>
       </w:r>
       <w:r>
-        <w:t>urité de votre applicatio</w:t>
-      </w:r>
-      <w:r>
-        <w:t>n</w:t>
+        <w:t>urité de votre application</w:t>
       </w:r>
       <w:r>
         <w:t>, lister les failles identifiées en les classant selon le top 10 2025 OWASP</w:t>
@@ -1097,8 +1136,42 @@
         <w:pStyle w:val="Corpsdetexte"/>
       </w:pPr>
       <w:r>
-        <w:t>Votre code sera versionné sur Github et un .gitignore empêchera de versionner les binaires npm (dossiers node_modules</w:t>
-      </w:r>
+        <w:t xml:space="preserve">Votre code sera versionné sur </w:t>
+      </w:r>
+      <w:proofErr w:type="spellStart"/>
+      <w:r>
+        <w:t>Github</w:t>
+      </w:r>
+      <w:proofErr w:type="spellEnd"/>
+      <w:r>
+        <w:t xml:space="preserve"> et </w:t>
+      </w:r>
+      <w:proofErr w:type="gramStart"/>
+      <w:r>
+        <w:t>un .</w:t>
+      </w:r>
+      <w:proofErr w:type="spellStart"/>
+      <w:r>
+        <w:t>gitignore</w:t>
+      </w:r>
+      <w:proofErr w:type="spellEnd"/>
+      <w:proofErr w:type="gramEnd"/>
+      <w:r>
+        <w:t xml:space="preserve"> empêchera de versionner les binaires </w:t>
+      </w:r>
+      <w:proofErr w:type="spellStart"/>
+      <w:r>
+        <w:t>npm</w:t>
+      </w:r>
+      <w:proofErr w:type="spellEnd"/>
+      <w:r>
+        <w:t xml:space="preserve"> (dossiers </w:t>
+      </w:r>
+      <w:proofErr w:type="spellStart"/>
+      <w:r>
+        <w:t>node_modules</w:t>
+      </w:r>
+      <w:proofErr w:type="spellEnd"/>
       <w:r>
         <w:t>)</w:t>
       </w:r>
@@ -1106,10 +1179,7 @@
         <w:t xml:space="preserve"> ainsi que les données sensibles contenues dans le fichier env</w:t>
       </w:r>
       <w:r>
-        <w:t>.</w:t>
-      </w:r>
-      <w:r>
-        <w:t xml:space="preserve"> Votre dépôt sera partagé avec votre chef de projet.</w:t>
+        <w:t>. Votre dépôt sera partagé avec votre chef de projet.</w:t>
       </w:r>
     </w:p>
     <w:p>
@@ -1128,9 +1198,11 @@
           <w:numId w:val="4"/>
         </w:numPr>
       </w:pPr>
+      <w:proofErr w:type="spellStart"/>
       <w:r>
         <w:t>GitJournal</w:t>
       </w:r>
+      <w:proofErr w:type="spellEnd"/>
     </w:p>
     <w:p>
       <w:pPr>
@@ -1209,7 +1281,21 @@
         <w:rPr>
           <w:lang w:val="fr-CH"/>
         </w:rPr>
-        <w:t>Release sur github v1.0.0 contenant</w:t>
+        <w:t xml:space="preserve">Release sur </w:t>
+      </w:r>
+      <w:proofErr w:type="spellStart"/>
+      <w:r>
+        <w:rPr>
+          <w:lang w:val="fr-CH"/>
+        </w:rPr>
+        <w:t>github</w:t>
+      </w:r>
+      <w:proofErr w:type="spellEnd"/>
+      <w:r>
+        <w:rPr>
+          <w:lang w:val="fr-CH"/>
+        </w:rPr>
+        <w:t xml:space="preserve"> v1.0.0 contenant</w:t>
       </w:r>
     </w:p>
     <w:p>
@@ -1349,9 +1435,22 @@
           <w:p>
             <w:pPr>
               <w:pStyle w:val="Corpsdetexte"/>
+              <w:jc w:val="left"/>
             </w:pPr>
             <w:r>
               <w:t>Candidat :</w:t>
+            </w:r>
+            <w:r>
+              <w:t xml:space="preserve"> </w:t>
+            </w:r>
+          </w:p>
+          <w:p>
+            <w:pPr>
+              <w:pStyle w:val="Corpsdetexte"/>
+              <w:jc w:val="left"/>
+            </w:pPr>
+            <w:r>
+              <w:t>Jonathan Junod</w:t>
             </w:r>
           </w:p>
         </w:tc>
@@ -1369,6 +1468,9 @@
             <w:pPr>
               <w:pStyle w:val="Corpsdetexte"/>
             </w:pPr>
+            <w:r>
+              <w:t>18.03.2026</w:t>
+            </w:r>
           </w:p>
           <w:p>
             <w:pPr>
@@ -1383,8 +1485,11 @@
           </w:tcPr>
           <w:p>
             <w:pPr>
-              <w:pStyle w:val="Corpsdetexte"/>
+              <w:pStyle w:val="Citationintense"/>
             </w:pPr>
+            <w:r>
+              <w:t>JJ</w:t>
+            </w:r>
           </w:p>
         </w:tc>
       </w:tr>
@@ -1454,7 +1559,7 @@
 </file>
 
 <file path=word/endnotes.xml><?xml version="1.0" encoding="utf-8"?>
-<w:endnotes xmlns:wpc="http://schemas.microsoft.com/office/word/2010/wordprocessingCanvas" xmlns:cx="http://schemas.microsoft.com/office/drawing/2014/chartex" xmlns:cx1="http://schemas.microsoft.com/office/drawing/2015/9/8/chartex" xmlns:cx2="http://schemas.microsoft.com/office/drawing/2015/10/21/chartex" xmlns:cx3="http://schemas.microsoft.com/office/drawing/2016/5/9/chartex" xmlns:cx4="http://schemas.microsoft.com/office/drawing/2016/5/10/chartex" xmlns:cx5="http://schemas.microsoft.com/office/drawing/2016/5/11/chartex" xmlns:cx6="http://schemas.microsoft.com/office/drawing/2016/5/12/chartex" xmlns:cx7="http://schemas.microsoft.com/office/drawing/2016/5/13/chartex" xmlns:cx8="http://schemas.microsoft.com/office/drawing/2016/5/14/chartex" xmlns:mc="http://schemas.openxmlformats.org/markup-compatibility/2006" xmlns:aink="http://schemas.microsoft.com/office/drawing/2016/ink" xmlns:am3d="http://schemas.microsoft.com/office/drawing/2017/model3d" xmlns:o="urn:schemas-microsoft-com:office:office" xmlns:oel="http://schemas.microsoft.com/office/2019/extlst" xmlns:r="http://schemas.openxmlformats.org/officeDocument/2006/relationships" xmlns:m="http://schemas.openxmlformats.org/officeDocument/2006/math" xmlns:v="urn:schemas-microsoft-com:vml" xmlns:wp14="http://schemas.microsoft.com/office/word/2010/wordprocessingDrawing" xmlns:wp="http://schemas.openxmlformats.org/drawingml/2006/wordprocessingDrawing" xmlns:w10="urn:schemas-microsoft-com:office:word" xmlns:w="http://schemas.openxmlformats.org/wordprocessingml/2006/main" xmlns:w14="http://schemas.microsoft.com/office/word/2010/wordml" xmlns:w15="http://schemas.microsoft.com/office/word/2012/wordml" xmlns:w16cex="http://schemas.microsoft.com/office/word/2018/wordml/cex" xmlns:w16cid="http://schemas.microsoft.com/office/word/2016/wordml/cid" xmlns:w16="http://schemas.microsoft.com/office/word/2018/wordml" xmlns:w16du="http://schemas.microsoft.com/office/word/2023/wordml/word16du" xmlns:w16sdtdh="http://schemas.microsoft.com/office/word/2020/wordml/sdtdatahash" xmlns:w16sdtfl="http://schemas.microsoft.com/office/word/2024/wordml/sdtformatlock" xmlns:w16se="http://schemas.microsoft.com/office/word/2015/wordml/symex" xmlns:wpg="http://schemas.microsoft.com/office/word/2010/wordprocessingGroup" xmlns:wpi="http://schemas.microsoft.com/office/word/2010/wordprocessingInk" xmlns:wne="http://schemas.microsoft.com/office/word/2006/wordml" xmlns:wps="http://schemas.microsoft.com/office/word/2010/wordprocessingShape" mc:Ignorable="w14 w15 w16se w16cid w16 w16cex w16sdtdh w16sdtfl w16du wp14">
+<w:endnotes xmlns:wpc="http://schemas.microsoft.com/office/word/2010/wordprocessingCanvas" xmlns:cx="http://schemas.microsoft.com/office/drawing/2014/chartex" xmlns:cx1="http://schemas.microsoft.com/office/drawing/2015/9/8/chartex" xmlns:cx2="http://schemas.microsoft.com/office/drawing/2015/10/21/chartex" xmlns:cx3="http://schemas.microsoft.com/office/drawing/2016/5/9/chartex" xmlns:cx4="http://schemas.microsoft.com/office/drawing/2016/5/10/chartex" xmlns:cx5="http://schemas.microsoft.com/office/drawing/2016/5/11/chartex" xmlns:cx6="http://schemas.microsoft.com/office/drawing/2016/5/12/chartex" xmlns:cx7="http://schemas.microsoft.com/office/drawing/2016/5/13/chartex" xmlns:cx8="http://schemas.microsoft.com/office/drawing/2016/5/14/chartex" xmlns:mc="http://schemas.openxmlformats.org/markup-compatibility/2006" xmlns:aink="http://schemas.microsoft.com/office/drawing/2016/ink" xmlns:am3d="http://schemas.microsoft.com/office/drawing/2017/model3d" xmlns:o="urn:schemas-microsoft-com:office:office" xmlns:oel="http://schemas.microsoft.com/office/2019/extlst" xmlns:r="http://schemas.openxmlformats.org/officeDocument/2006/relationships" xmlns:m="http://schemas.openxmlformats.org/officeDocument/2006/math" xmlns:v="urn:schemas-microsoft-com:vml" xmlns:wp14="http://schemas.microsoft.com/office/word/2010/wordprocessingDrawing" xmlns:wp="http://schemas.openxmlformats.org/drawingml/2006/wordprocessingDrawing" xmlns:w10="urn:schemas-microsoft-com:office:word" xmlns:w="http://schemas.openxmlformats.org/wordprocessingml/2006/main" xmlns:w14="http://schemas.microsoft.com/office/word/2010/wordml" xmlns:w15="http://schemas.microsoft.com/office/word/2012/wordml" xmlns:w16cex="http://schemas.microsoft.com/office/word/2018/wordml/cex" xmlns:w16cid="http://schemas.microsoft.com/office/word/2016/wordml/cid" xmlns:w16="http://schemas.microsoft.com/office/word/2018/wordml" xmlns:w16sdtdh="http://schemas.microsoft.com/office/word/2020/wordml/sdtdatahash" xmlns:w16se="http://schemas.microsoft.com/office/word/2015/wordml/symex" xmlns:wpg="http://schemas.microsoft.com/office/word/2010/wordprocessingGroup" xmlns:wpi="http://schemas.microsoft.com/office/word/2010/wordprocessingInk" xmlns:wne="http://schemas.microsoft.com/office/word/2006/wordml" xmlns:wps="http://schemas.microsoft.com/office/word/2010/wordprocessingShape" mc:Ignorable="w14 w15 w16se w16cid w16 w16cex w16sdtdh wp14">
   <w:endnote w:type="separator" w:id="-1">
     <w:p>
       <w:r>
@@ -1476,7 +1581,7 @@
 </file>
 
 <file path=word/footer1.xml><?xml version="1.0" encoding="utf-8"?>
-<w:ftr xmlns:wpc="http://schemas.microsoft.com/office/word/2010/wordprocessingCanvas" xmlns:cx="http://schemas.microsoft.com/office/drawing/2014/chartex" xmlns:cx1="http://schemas.microsoft.com/office/drawing/2015/9/8/chartex" xmlns:cx2="http://schemas.microsoft.com/office/drawing/2015/10/21/chartex" xmlns:cx3="http://schemas.microsoft.com/office/drawing/2016/5/9/chartex" xmlns:cx4="http://schemas.microsoft.com/office/drawing/2016/5/10/chartex" xmlns:cx5="http://schemas.microsoft.com/office/drawing/2016/5/11/chartex" xmlns:cx6="http://schemas.microsoft.com/office/drawing/2016/5/12/chartex" xmlns:cx7="http://schemas.microsoft.com/office/drawing/2016/5/13/chartex" xmlns:cx8="http://schemas.microsoft.com/office/drawing/2016/5/14/chartex" xmlns:mc="http://schemas.openxmlformats.org/markup-compatibility/2006" xmlns:aink="http://schemas.microsoft.com/office/drawing/2016/ink" xmlns:am3d="http://schemas.microsoft.com/office/drawing/2017/model3d" xmlns:o="urn:schemas-microsoft-com:office:office" xmlns:oel="http://schemas.microsoft.com/office/2019/extlst" xmlns:r="http://schemas.openxmlformats.org/officeDocument/2006/relationships" xmlns:m="http://schemas.openxmlformats.org/officeDocument/2006/math" xmlns:v="urn:schemas-microsoft-com:vml" xmlns:wp14="http://schemas.microsoft.com/office/word/2010/wordprocessingDrawing" xmlns:wp="http://schemas.openxmlformats.org/drawingml/2006/wordprocessingDrawing" xmlns:w10="urn:schemas-microsoft-com:office:word" xmlns:w="http://schemas.openxmlformats.org/wordprocessingml/2006/main" xmlns:w14="http://schemas.microsoft.com/office/word/2010/wordml" xmlns:w15="http://schemas.microsoft.com/office/word/2012/wordml" xmlns:w16cex="http://schemas.microsoft.com/office/word/2018/wordml/cex" xmlns:w16cid="http://schemas.microsoft.com/office/word/2016/wordml/cid" xmlns:w16="http://schemas.microsoft.com/office/word/2018/wordml" xmlns:w16du="http://schemas.microsoft.com/office/word/2023/wordml/word16du" xmlns:w16sdtdh="http://schemas.microsoft.com/office/word/2020/wordml/sdtdatahash" xmlns:w16sdtfl="http://schemas.microsoft.com/office/word/2024/wordml/sdtformatlock" xmlns:w16se="http://schemas.microsoft.com/office/word/2015/wordml/symex" xmlns:wpg="http://schemas.microsoft.com/office/word/2010/wordprocessingGroup" xmlns:wpi="http://schemas.microsoft.com/office/word/2010/wordprocessingInk" xmlns:wne="http://schemas.microsoft.com/office/word/2006/wordml" xmlns:wps="http://schemas.microsoft.com/office/word/2010/wordprocessingShape" mc:Ignorable="w14 w15 w16se w16cid w16 w16cex w16sdtdh w16sdtfl w16du wp14">
+<w:ftr xmlns:wpc="http://schemas.microsoft.com/office/word/2010/wordprocessingCanvas" xmlns:cx="http://schemas.microsoft.com/office/drawing/2014/chartex" xmlns:cx1="http://schemas.microsoft.com/office/drawing/2015/9/8/chartex" xmlns:cx2="http://schemas.microsoft.com/office/drawing/2015/10/21/chartex" xmlns:cx3="http://schemas.microsoft.com/office/drawing/2016/5/9/chartex" xmlns:cx4="http://schemas.microsoft.com/office/drawing/2016/5/10/chartex" xmlns:cx5="http://schemas.microsoft.com/office/drawing/2016/5/11/chartex" xmlns:cx6="http://schemas.microsoft.com/office/drawing/2016/5/12/chartex" xmlns:cx7="http://schemas.microsoft.com/office/drawing/2016/5/13/chartex" xmlns:cx8="http://schemas.microsoft.com/office/drawing/2016/5/14/chartex" xmlns:mc="http://schemas.openxmlformats.org/markup-compatibility/2006" xmlns:aink="http://schemas.microsoft.com/office/drawing/2016/ink" xmlns:am3d="http://schemas.microsoft.com/office/drawing/2017/model3d" xmlns:o="urn:schemas-microsoft-com:office:office" xmlns:oel="http://schemas.microsoft.com/office/2019/extlst" xmlns:r="http://schemas.openxmlformats.org/officeDocument/2006/relationships" xmlns:m="http://schemas.openxmlformats.org/officeDocument/2006/math" xmlns:v="urn:schemas-microsoft-com:vml" xmlns:wp14="http://schemas.microsoft.com/office/word/2010/wordprocessingDrawing" xmlns:wp="http://schemas.openxmlformats.org/drawingml/2006/wordprocessingDrawing" xmlns:w10="urn:schemas-microsoft-com:office:word" xmlns:w="http://schemas.openxmlformats.org/wordprocessingml/2006/main" xmlns:w14="http://schemas.microsoft.com/office/word/2010/wordml" xmlns:w15="http://schemas.microsoft.com/office/word/2012/wordml" xmlns:w16cex="http://schemas.microsoft.com/office/word/2018/wordml/cex" xmlns:w16cid="http://schemas.microsoft.com/office/word/2016/wordml/cid" xmlns:w16="http://schemas.microsoft.com/office/word/2018/wordml" xmlns:w16sdtdh="http://schemas.microsoft.com/office/word/2020/wordml/sdtdatahash" xmlns:w16se="http://schemas.microsoft.com/office/word/2015/wordml/symex" xmlns:wpg="http://schemas.microsoft.com/office/word/2010/wordprocessingGroup" xmlns:wpi="http://schemas.microsoft.com/office/word/2010/wordprocessingInk" xmlns:wne="http://schemas.microsoft.com/office/word/2006/wordml" xmlns:wps="http://schemas.microsoft.com/office/word/2010/wordprocessingShape" mc:Ignorable="w14 w15 w16se w16cid w16 w16cex w16sdtdh wp14">
   <w:p>
     <w:pPr>
       <w:pStyle w:val="Pieddepage"/>
@@ -1534,11 +1639,19 @@
               <w:lang w:val="de-CH"/>
             </w:rPr>
           </w:pPr>
+          <w:proofErr w:type="gramStart"/>
           <w:r>
             <w:rPr>
               <w:lang w:val="de-CH"/>
             </w:rPr>
-            <w:t xml:space="preserve">Fichier : </w:t>
+            <w:t>Fichier :</w:t>
+          </w:r>
+          <w:proofErr w:type="gramEnd"/>
+          <w:r>
+            <w:rPr>
+              <w:lang w:val="de-CH"/>
+            </w:rPr>
+            <w:t xml:space="preserve"> </w:t>
           </w:r>
           <w:r>
             <w:fldChar w:fldCharType="begin"/>
@@ -1723,7 +1836,7 @@
               <w:rPr>
                 <w:noProof/>
               </w:rPr>
-              <w:t>17/03/2026 09:57:00</w:t>
+              <w:t>18/03/2026 10:18:00</w:t>
             </w:r>
           </w:fldSimple>
         </w:p>
@@ -1804,7 +1917,7 @@
             <w:rPr>
               <w:noProof/>
             </w:rPr>
-            <w:t>09:06</w:t>
+            <w:t>11:17</w:t>
           </w:r>
           <w:r>
             <w:fldChar w:fldCharType="end"/>
@@ -1833,7 +1946,7 @@
 </file>
 
 <file path=word/footer2.xml><?xml version="1.0" encoding="utf-8"?>
-<w:ftr xmlns:wpc="http://schemas.microsoft.com/office/word/2010/wordprocessingCanvas" xmlns:cx="http://schemas.microsoft.com/office/drawing/2014/chartex" xmlns:cx1="http://schemas.microsoft.com/office/drawing/2015/9/8/chartex" xmlns:cx2="http://schemas.microsoft.com/office/drawing/2015/10/21/chartex" xmlns:cx3="http://schemas.microsoft.com/office/drawing/2016/5/9/chartex" xmlns:cx4="http://schemas.microsoft.com/office/drawing/2016/5/10/chartex" xmlns:cx5="http://schemas.microsoft.com/office/drawing/2016/5/11/chartex" xmlns:cx6="http://schemas.microsoft.com/office/drawing/2016/5/12/chartex" xmlns:cx7="http://schemas.microsoft.com/office/drawing/2016/5/13/chartex" xmlns:cx8="http://schemas.microsoft.com/office/drawing/2016/5/14/chartex" xmlns:mc="http://schemas.openxmlformats.org/markup-compatibility/2006" xmlns:aink="http://schemas.microsoft.com/office/drawing/2016/ink" xmlns:am3d="http://schemas.microsoft.com/office/drawing/2017/model3d" xmlns:o="urn:schemas-microsoft-com:office:office" xmlns:oel="http://schemas.microsoft.com/office/2019/extlst" xmlns:r="http://schemas.openxmlformats.org/officeDocument/2006/relationships" xmlns:m="http://schemas.openxmlformats.org/officeDocument/2006/math" xmlns:v="urn:schemas-microsoft-com:vml" xmlns:wp14="http://schemas.microsoft.com/office/word/2010/wordprocessingDrawing" xmlns:wp="http://schemas.openxmlformats.org/drawingml/2006/wordprocessingDrawing" xmlns:w10="urn:schemas-microsoft-com:office:word" xmlns:w="http://schemas.openxmlformats.org/wordprocessingml/2006/main" xmlns:w14="http://schemas.microsoft.com/office/word/2010/wordml" xmlns:w15="http://schemas.microsoft.com/office/word/2012/wordml" xmlns:w16cex="http://schemas.microsoft.com/office/word/2018/wordml/cex" xmlns:w16cid="http://schemas.microsoft.com/office/word/2016/wordml/cid" xmlns:w16="http://schemas.microsoft.com/office/word/2018/wordml" xmlns:w16du="http://schemas.microsoft.com/office/word/2023/wordml/word16du" xmlns:w16sdtdh="http://schemas.microsoft.com/office/word/2020/wordml/sdtdatahash" xmlns:w16sdtfl="http://schemas.microsoft.com/office/word/2024/wordml/sdtformatlock" xmlns:w16se="http://schemas.microsoft.com/office/word/2015/wordml/symex" xmlns:wpg="http://schemas.microsoft.com/office/word/2010/wordprocessingGroup" xmlns:wpi="http://schemas.microsoft.com/office/word/2010/wordprocessingInk" xmlns:wne="http://schemas.microsoft.com/office/word/2006/wordml" xmlns:wps="http://schemas.microsoft.com/office/word/2010/wordprocessingShape" mc:Ignorable="w14 w15 w16se w16cid w16 w16cex w16sdtdh w16sdtfl w16du wp14">
+<w:ftr xmlns:wpc="http://schemas.microsoft.com/office/word/2010/wordprocessingCanvas" xmlns:cx="http://schemas.microsoft.com/office/drawing/2014/chartex" xmlns:cx1="http://schemas.microsoft.com/office/drawing/2015/9/8/chartex" xmlns:cx2="http://schemas.microsoft.com/office/drawing/2015/10/21/chartex" xmlns:cx3="http://schemas.microsoft.com/office/drawing/2016/5/9/chartex" xmlns:cx4="http://schemas.microsoft.com/office/drawing/2016/5/10/chartex" xmlns:cx5="http://schemas.microsoft.com/office/drawing/2016/5/11/chartex" xmlns:cx6="http://schemas.microsoft.com/office/drawing/2016/5/12/chartex" xmlns:cx7="http://schemas.microsoft.com/office/drawing/2016/5/13/chartex" xmlns:cx8="http://schemas.microsoft.com/office/drawing/2016/5/14/chartex" xmlns:mc="http://schemas.openxmlformats.org/markup-compatibility/2006" xmlns:aink="http://schemas.microsoft.com/office/drawing/2016/ink" xmlns:am3d="http://schemas.microsoft.com/office/drawing/2017/model3d" xmlns:o="urn:schemas-microsoft-com:office:office" xmlns:oel="http://schemas.microsoft.com/office/2019/extlst" xmlns:r="http://schemas.openxmlformats.org/officeDocument/2006/relationships" xmlns:m="http://schemas.openxmlformats.org/officeDocument/2006/math" xmlns:v="urn:schemas-microsoft-com:vml" xmlns:wp14="http://schemas.microsoft.com/office/word/2010/wordprocessingDrawing" xmlns:wp="http://schemas.openxmlformats.org/drawingml/2006/wordprocessingDrawing" xmlns:w10="urn:schemas-microsoft-com:office:word" xmlns:w="http://schemas.openxmlformats.org/wordprocessingml/2006/main" xmlns:w14="http://schemas.microsoft.com/office/word/2010/wordml" xmlns:w15="http://schemas.microsoft.com/office/word/2012/wordml" xmlns:w16cex="http://schemas.microsoft.com/office/word/2018/wordml/cex" xmlns:w16cid="http://schemas.microsoft.com/office/word/2016/wordml/cid" xmlns:w16="http://schemas.microsoft.com/office/word/2018/wordml" xmlns:w16sdtdh="http://schemas.microsoft.com/office/word/2020/wordml/sdtdatahash" xmlns:w16se="http://schemas.microsoft.com/office/word/2015/wordml/symex" xmlns:wpg="http://schemas.microsoft.com/office/word/2010/wordprocessingGroup" xmlns:wpi="http://schemas.microsoft.com/office/word/2010/wordprocessingInk" xmlns:wne="http://schemas.microsoft.com/office/word/2006/wordml" xmlns:wps="http://schemas.microsoft.com/office/word/2010/wordprocessingShape" mc:Ignorable="w14 w15 w16se w16cid w16 w16cex w16sdtdh wp14">
   <w:p>
     <w:pPr>
       <w:pStyle w:val="Pieddepage"/>
@@ -1911,7 +2024,7 @@
             </wp:anchor>
           </w:drawing>
         </mc:Choice>
-        <mc:Fallback xmlns:arto="http://schemas.microsoft.com/office/word/2006/arto" xmlns:a14="http://schemas.microsoft.com/office/drawing/2010/main" xmlns:a="http://schemas.openxmlformats.org/drawingml/2006/main">
+        <mc:Fallback xmlns:a="http://schemas.openxmlformats.org/drawingml/2006/main" xmlns:a14="http://schemas.microsoft.com/office/drawing/2010/main" xmlns:arto="http://schemas.microsoft.com/office/word/2006/arto" xmlns:w16sdtfl="http://schemas.microsoft.com/office/word/2024/wordml/sdtformatlock" xmlns:w16du="http://schemas.microsoft.com/office/word/2023/wordml/word16du">
           <w:pict w14:anchorId="0E5E3D4F">
             <v:line id="Line 2" style="position:absolute;z-index:251657728;visibility:visible;mso-wrap-style:square;mso-width-percent:0;mso-height-percent:0;mso-wrap-distance-left:9pt;mso-wrap-distance-top:0;mso-wrap-distance-right:9pt;mso-wrap-distance-bottom:0;mso-position-horizontal:absolute;mso-position-horizontal-relative:text;mso-position-vertical:absolute;mso-position-vertical-relative:text;mso-width-percent:0;mso-height-percent:0;mso-width-relative:page;mso-height-relative:page" o:spid="_x0000_s1026" from="-.5pt,-.1pt" to="496.35pt,-.1pt" w14:anchorId="115AFD38" o:gfxdata="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"/>
           </w:pict>
@@ -2131,7 +2244,7 @@
         <w:snapToGrid w:val="0"/>
         <w:sz w:val="12"/>
       </w:rPr>
-      <w:t>09:06</w:t>
+      <w:t>11:17</w:t>
     </w:r>
     <w:r>
       <w:rPr>
@@ -2273,7 +2386,7 @@
 </file>
 
 <file path=word/footnotes.xml><?xml version="1.0" encoding="utf-8"?>
-<w:footnotes xmlns:wpc="http://schemas.microsoft.com/office/word/2010/wordprocessingCanvas" xmlns:cx="http://schemas.microsoft.com/office/drawing/2014/chartex" xmlns:cx1="http://schemas.microsoft.com/office/drawing/2015/9/8/chartex" xmlns:cx2="http://schemas.microsoft.com/office/drawing/2015/10/21/chartex" xmlns:cx3="http://schemas.microsoft.com/office/drawing/2016/5/9/chartex" xmlns:cx4="http://schemas.microsoft.com/office/drawing/2016/5/10/chartex" xmlns:cx5="http://schemas.microsoft.com/office/drawing/2016/5/11/chartex" xmlns:cx6="http://schemas.microsoft.com/office/drawing/2016/5/12/chartex" xmlns:cx7="http://schemas.microsoft.com/office/drawing/2016/5/13/chartex" xmlns:cx8="http://schemas.microsoft.com/office/drawing/2016/5/14/chartex" xmlns:mc="http://schemas.openxmlformats.org/markup-compatibility/2006" xmlns:aink="http://schemas.microsoft.com/office/drawing/2016/ink" xmlns:am3d="http://schemas.microsoft.com/office/drawing/2017/model3d" xmlns:o="urn:schemas-microsoft-com:office:office" xmlns:oel="http://schemas.microsoft.com/office/2019/extlst" xmlns:r="http://schemas.openxmlformats.org/officeDocument/2006/relationships" xmlns:m="http://schemas.openxmlformats.org/officeDocument/2006/math" xmlns:v="urn:schemas-microsoft-com:vml" xmlns:wp14="http://schemas.microsoft.com/office/word/2010/wordprocessingDrawing" xmlns:wp="http://schemas.openxmlformats.org/drawingml/2006/wordprocessingDrawing" xmlns:w10="urn:schemas-microsoft-com:office:word" xmlns:w="http://schemas.openxmlformats.org/wordprocessingml/2006/main" xmlns:w14="http://schemas.microsoft.com/office/word/2010/wordml" xmlns:w15="http://schemas.microsoft.com/office/word/2012/wordml" xmlns:w16cex="http://schemas.microsoft.com/office/word/2018/wordml/cex" xmlns:w16cid="http://schemas.microsoft.com/office/word/2016/wordml/cid" xmlns:w16="http://schemas.microsoft.com/office/word/2018/wordml" xmlns:w16du="http://schemas.microsoft.com/office/word/2023/wordml/word16du" xmlns:w16sdtdh="http://schemas.microsoft.com/office/word/2020/wordml/sdtdatahash" xmlns:w16sdtfl="http://schemas.microsoft.com/office/word/2024/wordml/sdtformatlock" xmlns:w16se="http://schemas.microsoft.com/office/word/2015/wordml/symex" xmlns:wpg="http://schemas.microsoft.com/office/word/2010/wordprocessingGroup" xmlns:wpi="http://schemas.microsoft.com/office/word/2010/wordprocessingInk" xmlns:wne="http://schemas.microsoft.com/office/word/2006/wordml" xmlns:wps="http://schemas.microsoft.com/office/word/2010/wordprocessingShape" mc:Ignorable="w14 w15 w16se w16cid w16 w16cex w16sdtdh w16sdtfl w16du wp14">
+<w:footnotes xmlns:wpc="http://schemas.microsoft.com/office/word/2010/wordprocessingCanvas" xmlns:cx="http://schemas.microsoft.com/office/drawing/2014/chartex" xmlns:cx1="http://schemas.microsoft.com/office/drawing/2015/9/8/chartex" xmlns:cx2="http://schemas.microsoft.com/office/drawing/2015/10/21/chartex" xmlns:cx3="http://schemas.microsoft.com/office/drawing/2016/5/9/chartex" xmlns:cx4="http://schemas.microsoft.com/office/drawing/2016/5/10/chartex" xmlns:cx5="http://schemas.microsoft.com/office/drawing/2016/5/11/chartex" xmlns:cx6="http://schemas.microsoft.com/office/drawing/2016/5/12/chartex" xmlns:cx7="http://schemas.microsoft.com/office/drawing/2016/5/13/chartex" xmlns:cx8="http://schemas.microsoft.com/office/drawing/2016/5/14/chartex" xmlns:mc="http://schemas.openxmlformats.org/markup-compatibility/2006" xmlns:aink="http://schemas.microsoft.com/office/drawing/2016/ink" xmlns:am3d="http://schemas.microsoft.com/office/drawing/2017/model3d" xmlns:o="urn:schemas-microsoft-com:office:office" xmlns:oel="http://schemas.microsoft.com/office/2019/extlst" xmlns:r="http://schemas.openxmlformats.org/officeDocument/2006/relationships" xmlns:m="http://schemas.openxmlformats.org/officeDocument/2006/math" xmlns:v="urn:schemas-microsoft-com:vml" xmlns:wp14="http://schemas.microsoft.com/office/word/2010/wordprocessingDrawing" xmlns:wp="http://schemas.openxmlformats.org/drawingml/2006/wordprocessingDrawing" xmlns:w10="urn:schemas-microsoft-com:office:word" xmlns:w="http://schemas.openxmlformats.org/wordprocessingml/2006/main" xmlns:w14="http://schemas.microsoft.com/office/word/2010/wordml" xmlns:w15="http://schemas.microsoft.com/office/word/2012/wordml" xmlns:w16cex="http://schemas.microsoft.com/office/word/2018/wordml/cex" xmlns:w16cid="http://schemas.microsoft.com/office/word/2016/wordml/cid" xmlns:w16="http://schemas.microsoft.com/office/word/2018/wordml" xmlns:w16sdtdh="http://schemas.microsoft.com/office/word/2020/wordml/sdtdatahash" xmlns:w16se="http://schemas.microsoft.com/office/word/2015/wordml/symex" xmlns:wpg="http://schemas.microsoft.com/office/word/2010/wordprocessingGroup" xmlns:wpi="http://schemas.microsoft.com/office/word/2010/wordprocessingInk" xmlns:wne="http://schemas.microsoft.com/office/word/2006/wordml" xmlns:wps="http://schemas.microsoft.com/office/word/2010/wordprocessingShape" mc:Ignorable="w14 w15 w16se w16cid w16 w16cex w16sdtdh wp14">
   <w:footnote w:type="separator" w:id="-1">
     <w:p>
       <w:r>
@@ -2295,7 +2408,7 @@
 </file>
 
 <file path=word/header1.xml><?xml version="1.0" encoding="utf-8"?>
-<w:hdr xmlns:wpc="http://schemas.microsoft.com/office/word/2010/wordprocessingCanvas" xmlns:cx="http://schemas.microsoft.com/office/drawing/2014/chartex" xmlns:cx1="http://schemas.microsoft.com/office/drawing/2015/9/8/chartex" xmlns:cx2="http://schemas.microsoft.com/office/drawing/2015/10/21/chartex" xmlns:cx3="http://schemas.microsoft.com/office/drawing/2016/5/9/chartex" xmlns:cx4="http://schemas.microsoft.com/office/drawing/2016/5/10/chartex" xmlns:cx5="http://schemas.microsoft.com/office/drawing/2016/5/11/chartex" xmlns:cx6="http://schemas.microsoft.com/office/drawing/2016/5/12/chartex" xmlns:cx7="http://schemas.microsoft.com/office/drawing/2016/5/13/chartex" xmlns:cx8="http://schemas.microsoft.com/office/drawing/2016/5/14/chartex" xmlns:mc="http://schemas.openxmlformats.org/markup-compatibility/2006" xmlns:aink="http://schemas.microsoft.com/office/drawing/2016/ink" xmlns:am3d="http://schemas.microsoft.com/office/drawing/2017/model3d" xmlns:o="urn:schemas-microsoft-com:office:office" xmlns:oel="http://schemas.microsoft.com/office/2019/extlst" xmlns:r="http://schemas.openxmlformats.org/officeDocument/2006/relationships" xmlns:m="http://schemas.openxmlformats.org/officeDocument/2006/math" xmlns:v="urn:schemas-microsoft-com:vml" xmlns:wp14="http://schemas.microsoft.com/office/word/2010/wordprocessingDrawing" xmlns:wp="http://schemas.openxmlformats.org/drawingml/2006/wordprocessingDrawing" xmlns:w10="urn:schemas-microsoft-com:office:word" xmlns:w="http://schemas.openxmlformats.org/wordprocessingml/2006/main" xmlns:w14="http://schemas.microsoft.com/office/word/2010/wordml" xmlns:w15="http://schemas.microsoft.com/office/word/2012/wordml" xmlns:w16cex="http://schemas.microsoft.com/office/word/2018/wordml/cex" xmlns:w16cid="http://schemas.microsoft.com/office/word/2016/wordml/cid" xmlns:w16="http://schemas.microsoft.com/office/word/2018/wordml" xmlns:w16du="http://schemas.microsoft.com/office/word/2023/wordml/word16du" xmlns:w16sdtdh="http://schemas.microsoft.com/office/word/2020/wordml/sdtdatahash" xmlns:w16sdtfl="http://schemas.microsoft.com/office/word/2024/wordml/sdtformatlock" xmlns:w16se="http://schemas.microsoft.com/office/word/2015/wordml/symex" xmlns:wpg="http://schemas.microsoft.com/office/word/2010/wordprocessingGroup" xmlns:wpi="http://schemas.microsoft.com/office/word/2010/wordprocessingInk" xmlns:wne="http://schemas.microsoft.com/office/word/2006/wordml" xmlns:wps="http://schemas.microsoft.com/office/word/2010/wordprocessingShape" mc:Ignorable="w14 w15 w16se w16cid w16 w16cex w16sdtdh w16sdtfl w16du wp14">
+<w:hdr xmlns:wpc="http://schemas.microsoft.com/office/word/2010/wordprocessingCanvas" xmlns:cx="http://schemas.microsoft.com/office/drawing/2014/chartex" xmlns:cx1="http://schemas.microsoft.com/office/drawing/2015/9/8/chartex" xmlns:cx2="http://schemas.microsoft.com/office/drawing/2015/10/21/chartex" xmlns:cx3="http://schemas.microsoft.com/office/drawing/2016/5/9/chartex" xmlns:cx4="http://schemas.microsoft.com/office/drawing/2016/5/10/chartex" xmlns:cx5="http://schemas.microsoft.com/office/drawing/2016/5/11/chartex" xmlns:cx6="http://schemas.microsoft.com/office/drawing/2016/5/12/chartex" xmlns:cx7="http://schemas.microsoft.com/office/drawing/2016/5/13/chartex" xmlns:cx8="http://schemas.microsoft.com/office/drawing/2016/5/14/chartex" xmlns:mc="http://schemas.openxmlformats.org/markup-compatibility/2006" xmlns:aink="http://schemas.microsoft.com/office/drawing/2016/ink" xmlns:am3d="http://schemas.microsoft.com/office/drawing/2017/model3d" xmlns:o="urn:schemas-microsoft-com:office:office" xmlns:oel="http://schemas.microsoft.com/office/2019/extlst" xmlns:r="http://schemas.openxmlformats.org/officeDocument/2006/relationships" xmlns:m="http://schemas.openxmlformats.org/officeDocument/2006/math" xmlns:v="urn:schemas-microsoft-com:vml" xmlns:wp14="http://schemas.microsoft.com/office/word/2010/wordprocessingDrawing" xmlns:wp="http://schemas.openxmlformats.org/drawingml/2006/wordprocessingDrawing" xmlns:w10="urn:schemas-microsoft-com:office:word" xmlns:w="http://schemas.openxmlformats.org/wordprocessingml/2006/main" xmlns:w14="http://schemas.microsoft.com/office/word/2010/wordml" xmlns:w15="http://schemas.microsoft.com/office/word/2012/wordml" xmlns:w16cex="http://schemas.microsoft.com/office/word/2018/wordml/cex" xmlns:w16cid="http://schemas.microsoft.com/office/word/2016/wordml/cid" xmlns:w16="http://schemas.microsoft.com/office/word/2018/wordml" xmlns:w16sdtdh="http://schemas.microsoft.com/office/word/2020/wordml/sdtdatahash" xmlns:w16se="http://schemas.microsoft.com/office/word/2015/wordml/symex" xmlns:wpg="http://schemas.microsoft.com/office/word/2010/wordprocessingGroup" xmlns:wpi="http://schemas.microsoft.com/office/word/2010/wordprocessingInk" xmlns:wne="http://schemas.microsoft.com/office/word/2006/wordml" xmlns:wps="http://schemas.microsoft.com/office/word/2010/wordprocessingShape" mc:Ignorable="w14 w15 w16se w16cid w16 w16cex w16sdtdh wp14">
   <w:tbl>
     <w:tblPr>
       <w:tblW w:w="9781" w:type="dxa"/>
@@ -2385,7 +2498,11 @@
             <w:jc w:val="right"/>
           </w:pPr>
           <w:r>
-            <w:t>Projet P_</w:t>
+            <w:t xml:space="preserve">Projet </w:t>
+          </w:r>
+          <w:proofErr w:type="spellStart"/>
+          <w:r>
+            <w:t>P_</w:t>
           </w:r>
           <w:r>
             <w:t>Sec</w:t>
@@ -2396,6 +2513,7 @@
           <w:r>
             <w:t>pp</w:t>
           </w:r>
+          <w:proofErr w:type="spellEnd"/>
         </w:p>
       </w:tc>
     </w:tr>
@@ -2409,7 +2527,7 @@
 </file>
 
 <file path=word/header2.xml><?xml version="1.0" encoding="utf-8"?>
-<w:hdr xmlns:wpc="http://schemas.microsoft.com/office/word/2010/wordprocessingCanvas" xmlns:cx="http://schemas.microsoft.com/office/drawing/2014/chartex" xmlns:cx1="http://schemas.microsoft.com/office/drawing/2015/9/8/chartex" xmlns:cx2="http://schemas.microsoft.com/office/drawing/2015/10/21/chartex" xmlns:cx3="http://schemas.microsoft.com/office/drawing/2016/5/9/chartex" xmlns:cx4="http://schemas.microsoft.com/office/drawing/2016/5/10/chartex" xmlns:cx5="http://schemas.microsoft.com/office/drawing/2016/5/11/chartex" xmlns:cx6="http://schemas.microsoft.com/office/drawing/2016/5/12/chartex" xmlns:cx7="http://schemas.microsoft.com/office/drawing/2016/5/13/chartex" xmlns:cx8="http://schemas.microsoft.com/office/drawing/2016/5/14/chartex" xmlns:mc="http://schemas.openxmlformats.org/markup-compatibility/2006" xmlns:aink="http://schemas.microsoft.com/office/drawing/2016/ink" xmlns:am3d="http://schemas.microsoft.com/office/drawing/2017/model3d" xmlns:o="urn:schemas-microsoft-com:office:office" xmlns:oel="http://schemas.microsoft.com/office/2019/extlst" xmlns:r="http://schemas.openxmlformats.org/officeDocument/2006/relationships" xmlns:m="http://schemas.openxmlformats.org/officeDocument/2006/math" xmlns:v="urn:schemas-microsoft-com:vml" xmlns:wp14="http://schemas.microsoft.com/office/word/2010/wordprocessingDrawing" xmlns:wp="http://schemas.openxmlformats.org/drawingml/2006/wordprocessingDrawing" xmlns:w10="urn:schemas-microsoft-com:office:word" xmlns:w="http://schemas.openxmlformats.org/wordprocessingml/2006/main" xmlns:w14="http://schemas.microsoft.com/office/word/2010/wordml" xmlns:w15="http://schemas.microsoft.com/office/word/2012/wordml" xmlns:w16cex="http://schemas.microsoft.com/office/word/2018/wordml/cex" xmlns:w16cid="http://schemas.microsoft.com/office/word/2016/wordml/cid" xmlns:w16="http://schemas.microsoft.com/office/word/2018/wordml" xmlns:w16du="http://schemas.microsoft.com/office/word/2023/wordml/word16du" xmlns:w16sdtdh="http://schemas.microsoft.com/office/word/2020/wordml/sdtdatahash" xmlns:w16sdtfl="http://schemas.microsoft.com/office/word/2024/wordml/sdtformatlock" xmlns:w16se="http://schemas.microsoft.com/office/word/2015/wordml/symex" xmlns:wpg="http://schemas.microsoft.com/office/word/2010/wordprocessingGroup" xmlns:wpi="http://schemas.microsoft.com/office/word/2010/wordprocessingInk" xmlns:wne="http://schemas.microsoft.com/office/word/2006/wordml" xmlns:wps="http://schemas.microsoft.com/office/word/2010/wordprocessingShape" mc:Ignorable="w14 w15 w16se w16cid w16 w16cex w16sdtdh w16sdtfl w16du wp14">
+<w:hdr xmlns:wpc="http://schemas.microsoft.com/office/word/2010/wordprocessingCanvas" xmlns:cx="http://schemas.microsoft.com/office/drawing/2014/chartex" xmlns:cx1="http://schemas.microsoft.com/office/drawing/2015/9/8/chartex" xmlns:cx2="http://schemas.microsoft.com/office/drawing/2015/10/21/chartex" xmlns:cx3="http://schemas.microsoft.com/office/drawing/2016/5/9/chartex" xmlns:cx4="http://schemas.microsoft.com/office/drawing/2016/5/10/chartex" xmlns:cx5="http://schemas.microsoft.com/office/drawing/2016/5/11/chartex" xmlns:cx6="http://schemas.microsoft.com/office/drawing/2016/5/12/chartex" xmlns:cx7="http://schemas.microsoft.com/office/drawing/2016/5/13/chartex" xmlns:cx8="http://schemas.microsoft.com/office/drawing/2016/5/14/chartex" xmlns:mc="http://schemas.openxmlformats.org/markup-compatibility/2006" xmlns:aink="http://schemas.microsoft.com/office/drawing/2016/ink" xmlns:am3d="http://schemas.microsoft.com/office/drawing/2017/model3d" xmlns:o="urn:schemas-microsoft-com:office:office" xmlns:oel="http://schemas.microsoft.com/office/2019/extlst" xmlns:r="http://schemas.openxmlformats.org/officeDocument/2006/relationships" xmlns:m="http://schemas.openxmlformats.org/officeDocument/2006/math" xmlns:v="urn:schemas-microsoft-com:vml" xmlns:wp14="http://schemas.microsoft.com/office/word/2010/wordprocessingDrawing" xmlns:wp="http://schemas.openxmlformats.org/drawingml/2006/wordprocessingDrawing" xmlns:w10="urn:schemas-microsoft-com:office:word" xmlns:w="http://schemas.openxmlformats.org/wordprocessingml/2006/main" xmlns:w14="http://schemas.microsoft.com/office/word/2010/wordml" xmlns:w15="http://schemas.microsoft.com/office/word/2012/wordml" xmlns:w16cex="http://schemas.microsoft.com/office/word/2018/wordml/cex" xmlns:w16cid="http://schemas.microsoft.com/office/word/2016/wordml/cid" xmlns:w16="http://schemas.microsoft.com/office/word/2018/wordml" xmlns:w16sdtdh="http://schemas.microsoft.com/office/word/2020/wordml/sdtdatahash" xmlns:w16se="http://schemas.microsoft.com/office/word/2015/wordml/symex" xmlns:wpg="http://schemas.microsoft.com/office/word/2010/wordprocessingGroup" xmlns:wpi="http://schemas.microsoft.com/office/word/2010/wordprocessingInk" xmlns:wne="http://schemas.microsoft.com/office/word/2006/wordml" xmlns:wps="http://schemas.microsoft.com/office/word/2010/wordprocessingShape" mc:Ignorable="w14 w15 w16se w16cid w16 w16cex w16sdtdh wp14">
   <w:tbl>
     <w:tblPr>
       <w:tblW w:w="9754" w:type="dxa"/>
@@ -2520,8 +2638,13 @@
             <w:jc w:val="right"/>
           </w:pPr>
           <w:r>
-            <w:t>Projet : xxxxxx</w:t>
+            <w:t xml:space="preserve">Projet : </w:t>
           </w:r>
+          <w:proofErr w:type="spellStart"/>
+          <w:r>
+            <w:t>xxxxxx</w:t>
+          </w:r>
+          <w:proofErr w:type="spellEnd"/>
         </w:p>
       </w:tc>
     </w:tr>
@@ -2538,7 +2661,7 @@
 </file>
 
 <file path=word/numbering.xml><?xml version="1.0" encoding="utf-8"?>
-<w:numbering xmlns:wpc="http://schemas.microsoft.com/office/word/2010/wordprocessingCanvas" xmlns:cx="http://schemas.microsoft.com/office/drawing/2014/chartex" xmlns:cx1="http://schemas.microsoft.com/office/drawing/2015/9/8/chartex" xmlns:cx2="http://schemas.microsoft.com/office/drawing/2015/10/21/chartex" xmlns:cx3="http://schemas.microsoft.com/office/drawing/2016/5/9/chartex" xmlns:cx4="http://schemas.microsoft.com/office/drawing/2016/5/10/chartex" xmlns:cx5="http://schemas.microsoft.com/office/drawing/2016/5/11/chartex" xmlns:cx6="http://schemas.microsoft.com/office/drawing/2016/5/12/chartex" xmlns:cx7="http://schemas.microsoft.com/office/drawing/2016/5/13/chartex" xmlns:cx8="http://schemas.microsoft.com/office/drawing/2016/5/14/chartex" xmlns:mc="http://schemas.openxmlformats.org/markup-compatibility/2006" xmlns:aink="http://schemas.microsoft.com/office/drawing/2016/ink" xmlns:am3d="http://schemas.microsoft.com/office/drawing/2017/model3d" xmlns:o="urn:schemas-microsoft-com:office:office" xmlns:oel="http://schemas.microsoft.com/office/2019/extlst" xmlns:r="http://schemas.openxmlformats.org/officeDocument/2006/relationships" xmlns:m="http://schemas.openxmlformats.org/officeDocument/2006/math" xmlns:v="urn:schemas-microsoft-com:vml" xmlns:wp14="http://schemas.microsoft.com/office/word/2010/wordprocessingDrawing" xmlns:wp="http://schemas.openxmlformats.org/drawingml/2006/wordprocessingDrawing" xmlns:w10="urn:schemas-microsoft-com:office:word" xmlns:w="http://schemas.openxmlformats.org/wordprocessingml/2006/main" xmlns:w14="http://schemas.microsoft.com/office/word/2010/wordml" xmlns:w15="http://schemas.microsoft.com/office/word/2012/wordml" xmlns:w16cex="http://schemas.microsoft.com/office/word/2018/wordml/cex" xmlns:w16cid="http://schemas.microsoft.com/office/word/2016/wordml/cid" xmlns:w16="http://schemas.microsoft.com/office/word/2018/wordml" xmlns:w16du="http://schemas.microsoft.com/office/word/2023/wordml/word16du" xmlns:w16sdtdh="http://schemas.microsoft.com/office/word/2020/wordml/sdtdatahash" xmlns:w16sdtfl="http://schemas.microsoft.com/office/word/2024/wordml/sdtformatlock" xmlns:w16se="http://schemas.microsoft.com/office/word/2015/wordml/symex" xmlns:wpg="http://schemas.microsoft.com/office/word/2010/wordprocessingGroup" xmlns:wpi="http://schemas.microsoft.com/office/word/2010/wordprocessingInk" xmlns:wne="http://schemas.microsoft.com/office/word/2006/wordml" xmlns:wps="http://schemas.microsoft.com/office/word/2010/wordprocessingShape" mc:Ignorable="w14 w15 w16se w16cid w16 w16cex w16sdtdh w16sdtfl w16du wp14">
+<w:numbering xmlns:wpc="http://schemas.microsoft.com/office/word/2010/wordprocessingCanvas" xmlns:cx="http://schemas.microsoft.com/office/drawing/2014/chartex" xmlns:cx1="http://schemas.microsoft.com/office/drawing/2015/9/8/chartex" xmlns:cx2="http://schemas.microsoft.com/office/drawing/2015/10/21/chartex" xmlns:cx3="http://schemas.microsoft.com/office/drawing/2016/5/9/chartex" xmlns:cx4="http://schemas.microsoft.com/office/drawing/2016/5/10/chartex" xmlns:cx5="http://schemas.microsoft.com/office/drawing/2016/5/11/chartex" xmlns:cx6="http://schemas.microsoft.com/office/drawing/2016/5/12/chartex" xmlns:cx7="http://schemas.microsoft.com/office/drawing/2016/5/13/chartex" xmlns:cx8="http://schemas.microsoft.com/office/drawing/2016/5/14/chartex" xmlns:mc="http://schemas.openxmlformats.org/markup-compatibility/2006" xmlns:aink="http://schemas.microsoft.com/office/drawing/2016/ink" xmlns:am3d="http://schemas.microsoft.com/office/drawing/2017/model3d" xmlns:o="urn:schemas-microsoft-com:office:office" xmlns:oel="http://schemas.microsoft.com/office/2019/extlst" xmlns:r="http://schemas.openxmlformats.org/officeDocument/2006/relationships" xmlns:m="http://schemas.openxmlformats.org/officeDocument/2006/math" xmlns:v="urn:schemas-microsoft-com:vml" xmlns:wp14="http://schemas.microsoft.com/office/word/2010/wordprocessingDrawing" xmlns:wp="http://schemas.openxmlformats.org/drawingml/2006/wordprocessingDrawing" xmlns:w10="urn:schemas-microsoft-com:office:word" xmlns:w="http://schemas.openxmlformats.org/wordprocessingml/2006/main" xmlns:w14="http://schemas.microsoft.com/office/word/2010/wordml" xmlns:w15="http://schemas.microsoft.com/office/word/2012/wordml" xmlns:w16cex="http://schemas.microsoft.com/office/word/2018/wordml/cex" xmlns:w16cid="http://schemas.microsoft.com/office/word/2016/wordml/cid" xmlns:w16="http://schemas.microsoft.com/office/word/2018/wordml" xmlns:w16sdtdh="http://schemas.microsoft.com/office/word/2020/wordml/sdtdatahash" xmlns:w16se="http://schemas.microsoft.com/office/word/2015/wordml/symex" xmlns:wpg="http://schemas.microsoft.com/office/word/2010/wordprocessingGroup" xmlns:wpi="http://schemas.microsoft.com/office/word/2010/wordprocessingInk" xmlns:wne="http://schemas.microsoft.com/office/word/2006/wordml" xmlns:wps="http://schemas.microsoft.com/office/word/2010/wordprocessingShape" mc:Ignorable="w14 w15 w16se w16cid w16 w16cex w16sdtdh wp14">
   <w:abstractNum w:abstractNumId="0" w15:restartNumberingAfterBreak="0">
     <w:nsid w:val="26566A89"/>
     <w:multiLevelType w:val="multilevel"/>
@@ -3684,7 +3807,7 @@
 </file>
 
 <file path=word/styles.xml><?xml version="1.0" encoding="utf-8"?>
-<w:styles xmlns:mc="http://schemas.openxmlformats.org/markup-compatibility/2006" xmlns:r="http://schemas.openxmlformats.org/officeDocument/2006/relationships" xmlns:w="http://schemas.openxmlformats.org/wordprocessingml/2006/main" xmlns:w14="http://schemas.microsoft.com/office/word/2010/wordml" xmlns:w15="http://schemas.microsoft.com/office/word/2012/wordml" xmlns:w16cex="http://schemas.microsoft.com/office/word/2018/wordml/cex" xmlns:w16cid="http://schemas.microsoft.com/office/word/2016/wordml/cid" xmlns:w16="http://schemas.microsoft.com/office/word/2018/wordml" xmlns:w16du="http://schemas.microsoft.com/office/word/2023/wordml/word16du" xmlns:w16sdtdh="http://schemas.microsoft.com/office/word/2020/wordml/sdtdatahash" xmlns:w16sdtfl="http://schemas.microsoft.com/office/word/2024/wordml/sdtformatlock" xmlns:w16se="http://schemas.microsoft.com/office/word/2015/wordml/symex" mc:Ignorable="w14 w15 w16se w16cid w16 w16cex w16sdtdh w16sdtfl w16du">
+<w:styles xmlns:mc="http://schemas.openxmlformats.org/markup-compatibility/2006" xmlns:r="http://schemas.openxmlformats.org/officeDocument/2006/relationships" xmlns:w="http://schemas.openxmlformats.org/wordprocessingml/2006/main" xmlns:w14="http://schemas.microsoft.com/office/word/2010/wordml" xmlns:w15="http://schemas.microsoft.com/office/word/2012/wordml" xmlns:w16cex="http://schemas.microsoft.com/office/word/2018/wordml/cex" xmlns:w16cid="http://schemas.microsoft.com/office/word/2016/wordml/cid" xmlns:w16="http://schemas.microsoft.com/office/word/2018/wordml" xmlns:w16sdtdh="http://schemas.microsoft.com/office/word/2020/wordml/sdtdatahash" xmlns:w16se="http://schemas.microsoft.com/office/word/2015/wordml/symex" mc:Ignorable="w14 w15 w16se w16cid w16 w16cex w16sdtdh">
   <w:docDefaults>
     <w:rPrDefault>
       <w:rPr>
@@ -4958,6 +5081,45 @@
       <w:lang w:val="fr-FR" w:eastAsia="fr-FR"/>
     </w:rPr>
   </w:style>
+  <w:style w:type="paragraph" w:styleId="Citationintense">
+    <w:name w:val="Intense Quote"/>
+    <w:basedOn w:val="Normal"/>
+    <w:next w:val="Normal"/>
+    <w:link w:val="CitationintenseCar"/>
+    <w:uiPriority w:val="30"/>
+    <w:qFormat/>
+    <w:rsid w:val="00357F63"/>
+    <w:pPr>
+      <w:pBdr>
+        <w:top w:val="single" w:sz="4" w:space="10" w:color="4F81BD" w:themeColor="accent1"/>
+        <w:bottom w:val="single" w:sz="4" w:space="10" w:color="4F81BD" w:themeColor="accent1"/>
+      </w:pBdr>
+      <w:spacing w:before="360" w:after="360"/>
+      <w:ind w:left="864" w:right="864"/>
+      <w:jc w:val="center"/>
+    </w:pPr>
+    <w:rPr>
+      <w:i/>
+      <w:iCs/>
+      <w:color w:val="4F81BD" w:themeColor="accent1"/>
+    </w:rPr>
+  </w:style>
+  <w:style w:type="character" w:customStyle="1" w:styleId="CitationintenseCar">
+    <w:name w:val="Citation intense Car"/>
+    <w:basedOn w:val="Policepardfaut"/>
+    <w:link w:val="Citationintense"/>
+    <w:uiPriority w:val="30"/>
+    <w:rsid w:val="00357F63"/>
+    <w:rPr>
+      <w:rFonts w:ascii="Century Gothic" w:hAnsi="Century Gothic"/>
+      <w:i/>
+      <w:iCs/>
+      <w:color w:val="4F81BD" w:themeColor="accent1"/>
+      <w:sz w:val="22"/>
+      <w:szCs w:val="22"/>
+      <w:lang w:val="fr-FR" w:eastAsia="fr-FR"/>
+    </w:rPr>
+  </w:style>
 </w:styles>
 </file>
 
@@ -5245,30 +5407,6 @@
 </file>
 
 <file path=customXml/item1.xml><?xml version="1.0" encoding="utf-8"?>
-<p:properties xmlns:p="http://schemas.microsoft.com/office/2006/metadata/properties" xmlns:xsi="http://www.w3.org/2001/XMLSchema-instance" xmlns:pc="http://schemas.microsoft.com/office/infopath/2007/PartnerControls">
-  <documentManagement>
-    <lcf76f155ced4ddcb4097134ff3c332f xmlns="eb2b4dc0-5538-4988-a426-1e3bf3687743">
-      <Terms xmlns="http://schemas.microsoft.com/office/infopath/2007/PartnerControls"/>
-    </lcf76f155ced4ddcb4097134ff3c332f>
-    <TaxCatchAll xmlns="26488081-7094-48e3-a435-bbb366c5709a" xsi:nil="true"/>
-  </documentManagement>
-</p:properties>
-</file>
-
-<file path=customXml/item2.xml><?xml version="1.0" encoding="utf-8"?>
-<b:Sources xmlns:b="http://schemas.openxmlformats.org/officeDocument/2006/bibliography" xmlns="http://schemas.openxmlformats.org/officeDocument/2006/bibliography" SelectedStyle="\APASixthEditionOfficeOnline.xsl" StyleName="APA" Version="6"/>
-</file>
-
-<file path=customXml/item3.xml><?xml version="1.0" encoding="utf-8"?>
-<?mso-contentType ?>
-<FormTemplates xmlns="http://schemas.microsoft.com/sharepoint/v3/contenttype/forms">
-  <Display>DocumentLibraryForm</Display>
-  <Edit>DocumentLibraryForm</Edit>
-  <New>DocumentLibraryForm</New>
-</FormTemplates>
-</file>
-
-<file path=customXml/item4.xml><?xml version="1.0" encoding="utf-8"?>
 <ct:contentTypeSchema xmlns:ct="http://schemas.microsoft.com/office/2006/metadata/contentType" xmlns:ma="http://schemas.microsoft.com/office/2006/metadata/properties/metaAttributes" ct:_="" ma:_="" ma:contentTypeName="Document" ma:contentTypeID="0x010100BD12CA962D3BC343BA4881942FCA9ABD" ma:contentTypeVersion="13" ma:contentTypeDescription="Crée un document." ma:contentTypeScope="" ma:versionID="4207f87ec79b8c56022de88b50245427">
   <xsd:schema xmlns:xsd="http://www.w3.org/2001/XMLSchema" xmlns:xs="http://www.w3.org/2001/XMLSchema" xmlns:p="http://schemas.microsoft.com/office/2006/metadata/properties" xmlns:ns2="eb2b4dc0-5538-4988-a426-1e3bf3687743" xmlns:ns3="26488081-7094-48e3-a435-bbb366c5709a" targetNamespace="http://schemas.microsoft.com/office/2006/metadata/properties" ma:root="true" ma:fieldsID="c8b9e57990b270170ec0b599fde8fb20" ns2:_="" ns3:_="">
     <xsd:import namespace="eb2b4dc0-5538-4988-a426-1e3bf3687743"/>
@@ -5475,34 +5613,31 @@
 </ct:contentTypeSchema>
 </file>
 
-<file path=customXml/itemProps1.xml><?xml version="1.0" encoding="utf-8"?>
-<ds:datastoreItem xmlns:ds="http://schemas.openxmlformats.org/officeDocument/2006/customXml" ds:itemID="{B08EA9E8-3BB5-4A76-8042-864F008FC2FE}">
-  <ds:schemaRefs>
-    <ds:schemaRef ds:uri="http://schemas.microsoft.com/office/2006/metadata/properties"/>
-    <ds:schemaRef ds:uri="http://schemas.microsoft.com/office/infopath/2007/PartnerControls"/>
-    <ds:schemaRef ds:uri="eb2b4dc0-5538-4988-a426-1e3bf3687743"/>
-    <ds:schemaRef ds:uri="26488081-7094-48e3-a435-bbb366c5709a"/>
-  </ds:schemaRefs>
-</ds:datastoreItem>
+<file path=customXml/item2.xml><?xml version="1.0" encoding="utf-8"?>
+<?mso-contentType ?>
+<FormTemplates xmlns="http://schemas.microsoft.com/sharepoint/v3/contenttype/forms">
+  <Display>DocumentLibraryForm</Display>
+  <Edit>DocumentLibraryForm</Edit>
+  <New>DocumentLibraryForm</New>
+</FormTemplates>
 </file>
 
-<file path=customXml/itemProps2.xml><?xml version="1.0" encoding="utf-8"?>
-<ds:datastoreItem xmlns:ds="http://schemas.openxmlformats.org/officeDocument/2006/customXml" ds:itemID="{50E1B932-765D-4A46-B44C-F60190630047}">
-  <ds:schemaRefs>
-    <ds:schemaRef ds:uri="http://schemas.openxmlformats.org/officeDocument/2006/bibliography"/>
-  </ds:schemaRefs>
-</ds:datastoreItem>
+<file path=customXml/item3.xml><?xml version="1.0" encoding="utf-8"?>
+<b:Sources xmlns:b="http://schemas.openxmlformats.org/officeDocument/2006/bibliography" xmlns="http://schemas.openxmlformats.org/officeDocument/2006/bibliography" SelectedStyle="\APASixthEditionOfficeOnline.xsl" StyleName="APA" Version="6"/>
 </file>
 
-<file path=customXml/itemProps3.xml><?xml version="1.0" encoding="utf-8"?>
-<ds:datastoreItem xmlns:ds="http://schemas.openxmlformats.org/officeDocument/2006/customXml" ds:itemID="{9C3B4223-E2BD-4178-9996-49553D9C6F4A}">
-  <ds:schemaRefs>
-    <ds:schemaRef ds:uri="http://schemas.microsoft.com/sharepoint/v3/contenttype/forms"/>
-  </ds:schemaRefs>
-</ds:datastoreItem>
+<file path=customXml/item4.xml><?xml version="1.0" encoding="utf-8"?>
+<p:properties xmlns:p="http://schemas.microsoft.com/office/2006/metadata/properties" xmlns:xsi="http://www.w3.org/2001/XMLSchema-instance" xmlns:pc="http://schemas.microsoft.com/office/infopath/2007/PartnerControls">
+  <documentManagement>
+    <lcf76f155ced4ddcb4097134ff3c332f xmlns="eb2b4dc0-5538-4988-a426-1e3bf3687743">
+      <Terms xmlns="http://schemas.microsoft.com/office/infopath/2007/PartnerControls"/>
+    </lcf76f155ced4ddcb4097134ff3c332f>
+    <TaxCatchAll xmlns="26488081-7094-48e3-a435-bbb366c5709a" xsi:nil="true"/>
+  </documentManagement>
+</p:properties>
 </file>
 
-<file path=customXml/itemProps4.xml><?xml version="1.0" encoding="utf-8"?>
+<file path=customXml/itemProps1.xml><?xml version="1.0" encoding="utf-8"?>
 <ds:datastoreItem xmlns:ds="http://schemas.openxmlformats.org/officeDocument/2006/customXml" ds:itemID="{43231C6A-959F-4B0D-A98E-F4EFD2DE8C49}">
   <ds:schemaRefs>
     <ds:schemaRef ds:uri="http://schemas.microsoft.com/office/2006/metadata/contentType"/>
@@ -5519,4 +5654,31 @@
     <ds:schemaRef ds:uri="http://schemas.microsoft.com/internal/obd"/>
   </ds:schemaRefs>
 </ds:datastoreItem>
+</file>
+
+<file path=customXml/itemProps2.xml><?xml version="1.0" encoding="utf-8"?>
+<ds:datastoreItem xmlns:ds="http://schemas.openxmlformats.org/officeDocument/2006/customXml" ds:itemID="{9C3B4223-E2BD-4178-9996-49553D9C6F4A}">
+  <ds:schemaRefs>
+    <ds:schemaRef ds:uri="http://schemas.microsoft.com/sharepoint/v3/contenttype/forms"/>
+  </ds:schemaRefs>
+</ds:datastoreItem>
+</file>
+
+<file path=customXml/itemProps3.xml><?xml version="1.0" encoding="utf-8"?>
+<ds:datastoreItem xmlns:ds="http://schemas.openxmlformats.org/officeDocument/2006/customXml" ds:itemID="{50E1B932-765D-4A46-B44C-F60190630047}">
+  <ds:schemaRefs>
+    <ds:schemaRef ds:uri="http://schemas.openxmlformats.org/officeDocument/2006/bibliography"/>
+  </ds:schemaRefs>
+</ds:datastoreItem>
+</file>
+
+<file path=customXml/itemProps4.xml><?xml version="1.0" encoding="utf-8"?>
+<ds:datastoreItem xmlns:ds="http://schemas.openxmlformats.org/officeDocument/2006/customXml" ds:itemID="{B08EA9E8-3BB5-4A76-8042-864F008FC2FE}">
+  <ds:schemaRefs>
+    <ds:schemaRef ds:uri="http://schemas.microsoft.com/office/2006/metadata/properties"/>
+    <ds:schemaRef ds:uri="http://schemas.microsoft.com/office/infopath/2007/PartnerControls"/>
+    <ds:schemaRef ds:uri="eb2b4dc0-5538-4988-a426-1e3bf3687743"/>
+    <ds:schemaRef ds:uri="26488081-7094-48e3-a435-bbb366c5709a"/>
+  </ds:schemaRefs>
+</ds:datastoreItem>
 </file>
</xml_diff>